<commit_message>
finalizing report for submission
</commit_message>
<xml_diff>
--- a/report/PhishGuard_AI_IEEE_Report.docx
+++ b/report/PhishGuard_AI_IEEE_Report.docx
@@ -4,6 +4,342 @@
   <w:body>
     <w:p>
       <w:pPr>
+        <w:spacing w:after="240"/>
+        <w:jc w:val="center"/>
+      </w:pPr>
+      <w:r>
+        <w:drawing>
+          <wp:inline distT="0" distB="0" distL="0" distR="0">
+            <wp:extent cx="4476750" cy="990600"/>
+            <wp:effectExtent t="0" r="0" b="0" l="0"/>
+            <wp:docPr id="1" name="" descr="" title=""/>
+            <wp:cNvGraphicFramePr>
+              <a:graphicFrameLocks xmlns:a="http://schemas.openxmlformats.org/drawingml/2006/main" noChangeAspect="1"/>
+            </wp:cNvGraphicFramePr>
+            <a:graphic xmlns:a="http://schemas.openxmlformats.org/drawingml/2006/main">
+              <a:graphicData uri="http://schemas.openxmlformats.org/drawingml/2006/picture">
+                <pic:pic xmlns:pic="http://schemas.openxmlformats.org/drawingml/2006/picture">
+                  <pic:nvPicPr>
+                    <pic:cNvPr id="0" name="" descr=""/>
+                    <pic:cNvPicPr>
+                      <a:picLocks noChangeAspect="1" noChangeArrowheads="1"/>
+                    </pic:cNvPicPr>
+                  </pic:nvPicPr>
+                  <pic:blipFill>
+                    <a:blip r:embed="rId7" cstate="none"/>
+                    <a:srcRect/>
+                    <a:stretch>
+                      <a:fillRect/>
+                    </a:stretch>
+                  </pic:blipFill>
+                  <pic:spPr bwMode="auto">
+                    <a:xfrm>
+                      <a:off x="0" y="0"/>
+                      <a:ext cx="4476750" cy="990600"/>
+                    </a:xfrm>
+                    <a:prstGeom prst="rect">
+                      <a:avLst/>
+                    </a:prstGeom>
+                  </pic:spPr>
+                </pic:pic>
+              </a:graphicData>
+            </a:graphic>
+          </wp:inline>
+        </w:drawing>
+      </w:r>
+    </w:p>
+    <w:tbl>
+      <w:tblPr>
+        <w:tblW w:type="dxa" w:w="9360"/>
+        <w:tblBorders>
+          <w:top w:val="single" w:color="auto" w:sz="4"/>
+          <w:left w:val="single" w:color="auto" w:sz="4"/>
+          <w:bottom w:val="single" w:color="auto" w:sz="4"/>
+          <w:right w:val="single" w:color="auto" w:sz="4"/>
+          <w:insideH w:val="single" w:color="auto" w:sz="4"/>
+          <w:insideV w:val="single" w:color="auto" w:sz="4"/>
+        </w:tblBorders>
+      </w:tblPr>
+      <w:tblGrid>
+        <w:gridCol w:w="100"/>
+      </w:tblGrid>
+      <w:tr>
+        <w:tc>
+          <w:tcPr>
+            <w:tcBorders>
+              <w:top w:val="single" w:color="000000" w:sz="6"/>
+              <w:left w:val="single" w:color="000000" w:sz="6"/>
+              <w:bottom w:val="single" w:color="000000" w:sz="6"/>
+              <w:right w:val="single" w:color="000000" w:sz="6"/>
+            </w:tcBorders>
+            <w:tcMar>
+              <w:top w:type="dxa" w:w="300"/>
+              <w:left w:type="dxa" w:w="300"/>
+              <w:bottom w:type="dxa" w:w="300"/>
+              <w:right w:type="dxa" w:w="300"/>
+            </w:tcMar>
+          </w:tcPr>
+          <w:p>
+            <w:pPr>
+              <w:spacing w:after="400"/>
+              <w:jc w:val="center"/>
+            </w:pPr>
+            <w:r>
+              <w:rPr>
+                <w:rFonts w:ascii="Times New Roman" w:cs="Times New Roman" w:eastAsia="Times New Roman" w:hAnsi="Times New Roman"/>
+                <w:sz w:val="28"/>
+                <w:szCs w:val="28"/>
+              </w:rPr>
+              <w:t xml:space="preserve">PhishGuard AI: A Machine Learning Approach to Phishing Email Detection</w:t>
+            </w:r>
+          </w:p>
+          <w:p>
+            <w:pPr>
+              <w:spacing w:after="200"/>
+            </w:pPr>
+          </w:p>
+          <w:p>
+            <w:pPr>
+              <w:spacing w:after="200"/>
+            </w:pPr>
+          </w:p>
+          <w:p>
+            <w:pPr>
+              <w:jc w:val="center"/>
+            </w:pPr>
+            <w:r>
+              <w:drawing>
+                <wp:inline distT="0" distB="0" distL="0" distR="0">
+                  <wp:extent cx="1619250" cy="1609725"/>
+                  <wp:effectExtent t="0" r="0" b="0" l="0"/>
+                  <wp:docPr id="1" name="" descr="" title=""/>
+                  <wp:cNvGraphicFramePr>
+                    <a:graphicFrameLocks xmlns:a="http://schemas.openxmlformats.org/drawingml/2006/main" noChangeAspect="1"/>
+                  </wp:cNvGraphicFramePr>
+                  <a:graphic xmlns:a="http://schemas.openxmlformats.org/drawingml/2006/main">
+                    <a:graphicData uri="http://schemas.openxmlformats.org/drawingml/2006/picture">
+                      <pic:pic xmlns:pic="http://schemas.openxmlformats.org/drawingml/2006/picture">
+                        <pic:nvPicPr>
+                          <pic:cNvPr id="0" name="" descr=""/>
+                          <pic:cNvPicPr>
+                            <a:picLocks noChangeAspect="1" noChangeArrowheads="1"/>
+                          </pic:cNvPicPr>
+                        </pic:nvPicPr>
+                        <pic:blipFill>
+                          <a:blip r:embed="rId8" cstate="none"/>
+                          <a:srcRect/>
+                          <a:stretch>
+                            <a:fillRect/>
+                          </a:stretch>
+                        </pic:blipFill>
+                        <pic:spPr bwMode="auto">
+                          <a:xfrm>
+                            <a:off x="0" y="0"/>
+                            <a:ext cx="1619250" cy="1609725"/>
+                          </a:xfrm>
+                          <a:prstGeom prst="rect">
+                            <a:avLst/>
+                          </a:prstGeom>
+                        </pic:spPr>
+                      </pic:pic>
+                    </a:graphicData>
+                  </a:graphic>
+                </wp:inline>
+              </w:drawing>
+            </w:r>
+          </w:p>
+          <w:p>
+            <w:pPr>
+              <w:spacing w:after="40" w:before="200"/>
+              <w:jc w:val="center"/>
+            </w:pPr>
+            <w:r>
+              <w:rPr>
+                <w:rFonts w:ascii="Times New Roman" w:cs="Times New Roman" w:eastAsia="Times New Roman" w:hAnsi="Times New Roman"/>
+                <w:b/>
+                <w:bCs/>
+                <w:sz w:val="40"/>
+                <w:szCs w:val="40"/>
+              </w:rPr>
+              <w:t xml:space="preserve">Project Report</w:t>
+            </w:r>
+          </w:p>
+          <w:p>
+            <w:pPr>
+              <w:spacing w:after="400"/>
+              <w:jc w:val="center"/>
+            </w:pPr>
+            <w:r>
+              <w:rPr>
+                <w:rFonts w:ascii="Times New Roman" w:cs="Times New Roman" w:eastAsia="Times New Roman" w:hAnsi="Times New Roman"/>
+                <w:sz w:val="26"/>
+                <w:szCs w:val="26"/>
+              </w:rPr>
+              <w:t xml:space="preserve">15</w:t>
+            </w:r>
+            <w:r>
+              <w:rPr>
+                <w:rFonts w:ascii="Times New Roman" w:cs="Times New Roman" w:eastAsia="Times New Roman" w:hAnsi="Times New Roman"/>
+                <w:sz w:val="26"/>
+                <w:szCs w:val="26"/>
+                <w:vertAlign w:val="superscript"/>
+              </w:rPr>
+              <w:t xml:space="preserve">th</w:t>
+            </w:r>
+            <w:r>
+              <w:rPr>
+                <w:rFonts w:ascii="Times New Roman" w:cs="Times New Roman" w:eastAsia="Times New Roman" w:hAnsi="Times New Roman"/>
+                <w:sz w:val="26"/>
+                <w:szCs w:val="26"/>
+              </w:rPr>
+              <w:t xml:space="preserve"> June to 30</w:t>
+            </w:r>
+            <w:r>
+              <w:rPr>
+                <w:rFonts w:ascii="Times New Roman" w:cs="Times New Roman" w:eastAsia="Times New Roman" w:hAnsi="Times New Roman"/>
+                <w:sz w:val="26"/>
+                <w:szCs w:val="26"/>
+                <w:vertAlign w:val="superscript"/>
+              </w:rPr>
+              <w:t xml:space="preserve">th</w:t>
+            </w:r>
+            <w:r>
+              <w:rPr>
+                <w:rFonts w:ascii="Times New Roman" w:cs="Times New Roman" w:eastAsia="Times New Roman" w:hAnsi="Times New Roman"/>
+                <w:sz w:val="26"/>
+                <w:szCs w:val="26"/>
+              </w:rPr>
+              <w:t xml:space="preserve"> July 2026</w:t>
+            </w:r>
+          </w:p>
+          <w:p>
+            <w:pPr>
+              <w:spacing w:after="300"/>
+            </w:pPr>
+          </w:p>
+          <w:p>
+            <w:pPr>
+              <w:spacing w:after="300"/>
+            </w:pPr>
+          </w:p>
+          <w:p>
+            <w:pPr>
+              <w:spacing w:after="160"/>
+              <w:jc w:val="left"/>
+            </w:pPr>
+            <w:r>
+              <w:rPr>
+                <w:rFonts w:ascii="Times New Roman" w:cs="Times New Roman" w:eastAsia="Times New Roman" w:hAnsi="Times New Roman"/>
+                <w:sz w:val="24"/>
+                <w:szCs w:val="24"/>
+              </w:rPr>
+              <w:t xml:space="preserve">Student Name: Shreya G Amin</w:t>
+            </w:r>
+          </w:p>
+          <w:p>
+            <w:pPr>
+              <w:spacing w:after="160"/>
+              <w:jc w:val="left"/>
+            </w:pPr>
+            <w:r>
+              <w:rPr>
+                <w:rFonts w:ascii="Times New Roman" w:cs="Times New Roman" w:eastAsia="Times New Roman" w:hAnsi="Times New Roman"/>
+                <w:sz w:val="24"/>
+                <w:szCs w:val="24"/>
+              </w:rPr>
+              <w:t xml:space="preserve">Institute Name: NMAM Institute of Technology, Nitte</w:t>
+            </w:r>
+          </w:p>
+          <w:p>
+            <w:pPr>
+              <w:spacing w:after="160"/>
+              <w:jc w:val="left"/>
+            </w:pPr>
+            <w:r>
+              <w:rPr>
+                <w:rFonts w:ascii="Times New Roman" w:cs="Times New Roman" w:eastAsia="Times New Roman" w:hAnsi="Times New Roman"/>
+                <w:sz w:val="24"/>
+                <w:szCs w:val="24"/>
+              </w:rPr>
+              <w:t xml:space="preserve">Institute Roll no.: NNM24CS352</w:t>
+            </w:r>
+          </w:p>
+          <w:p>
+            <w:pPr>
+              <w:spacing w:after="160"/>
+              <w:jc w:val="left"/>
+            </w:pPr>
+            <w:r>
+              <w:rPr>
+                <w:rFonts w:ascii="Times New Roman" w:cs="Times New Roman" w:eastAsia="Times New Roman" w:hAnsi="Times New Roman"/>
+                <w:sz w:val="24"/>
+                <w:szCs w:val="24"/>
+              </w:rPr>
+              <w:t xml:space="preserve">Enrollment no.: 760225</w:t>
+            </w:r>
+          </w:p>
+        </w:tc>
+      </w:tr>
+    </w:tbl>
+    <w:p>
+      <w:pPr>
+        <w:spacing w:before="400"/>
+        <w:jc w:val="center"/>
+      </w:pPr>
+      <w:r>
+        <w:drawing>
+          <wp:inline distT="0" distB="0" distL="0" distR="0">
+            <wp:extent cx="4476750" cy="409575"/>
+            <wp:effectExtent t="0" r="0" b="0" l="0"/>
+            <wp:docPr id="1" name="" descr="" title=""/>
+            <wp:cNvGraphicFramePr>
+              <a:graphicFrameLocks xmlns:a="http://schemas.openxmlformats.org/drawingml/2006/main" noChangeAspect="1"/>
+            </wp:cNvGraphicFramePr>
+            <a:graphic xmlns:a="http://schemas.openxmlformats.org/drawingml/2006/main">
+              <a:graphicData uri="http://schemas.openxmlformats.org/drawingml/2006/picture">
+                <pic:pic xmlns:pic="http://schemas.openxmlformats.org/drawingml/2006/picture">
+                  <pic:nvPicPr>
+                    <pic:cNvPr id="0" name="" descr=""/>
+                    <pic:cNvPicPr>
+                      <a:picLocks noChangeAspect="1" noChangeArrowheads="1"/>
+                    </pic:cNvPicPr>
+                  </pic:nvPicPr>
+                  <pic:blipFill>
+                    <a:blip r:embed="rId9" cstate="none"/>
+                    <a:srcRect/>
+                    <a:stretch>
+                      <a:fillRect/>
+                    </a:stretch>
+                  </pic:blipFill>
+                  <pic:spPr bwMode="auto">
+                    <a:xfrm>
+                      <a:off x="0" y="0"/>
+                      <a:ext cx="4476750" cy="409575"/>
+                    </a:xfrm>
+                    <a:prstGeom prst="rect">
+                      <a:avLst/>
+                    </a:prstGeom>
+                  </pic:spPr>
+                </pic:pic>
+              </a:graphicData>
+            </a:graphic>
+          </wp:inline>
+        </w:drawing>
+      </w:r>
+    </w:p>
+    <w:p>
+      <w:pPr>
+        <w:sectPr>
+          <w:type w:val="nextPage"/>
+          <w:pgSz w:w="12240" w:h="15840" w:orient="portrait"/>
+          <w:pgMar w:top="863" w:right="1296" w:bottom="863" w:left="1296" w:header="708" w:footer="708" w:gutter="0"/>
+          <w:pgNumType/>
+          <w:docGrid w:linePitch="360"/>
+        </w:sectPr>
+      </w:pPr>
+    </w:p>
+    <w:p>
+      <w:pPr>
         <w:spacing w:after="160"/>
         <w:jc w:val="center"/>
       </w:pPr>
@@ -81,7 +417,7 @@
     <w:p>
       <w:pPr>
         <w:sectPr>
-          <w:type w:val="continuous"/>
+          <w:type w:val="nextPage"/>
           <w:pgSz w:w="12240" w:h="15840" w:orient="portrait"/>
           <w:pgMar w:top="1080" w:right="1080" w:bottom="1080" w:left="1080" w:header="708" w:footer="708" w:gutter="0"/>
           <w:pgNumType/>

</xml_diff>